<commit_message>
docs: update resume document to latest version
</commit_message>
<xml_diff>
--- a/public/resume.docx
+++ b/public/resume.docx
@@ -47,7 +47,7 @@
         </w:rPr>
         <w:t xml:space="preserve">Lesterdannlopez7@gmail.com  |  </w:t>
       </w:r>
-      <w:hyperlink w:history="1" r:id="rIdbhxtru-krmlpdhoteh5w1">
+      <w:hyperlink w:history="1" r:id="rIdjfztqnejb1foe-7fczcsd">
         <w:r>
           <w:rPr>
             <w:rFonts w:ascii="Arial" w:cs="Arial" w:eastAsia="Arial" w:hAnsi="Arial"/>
@@ -67,7 +67,7 @@
         </w:rPr>
         <w:t xml:space="preserve">  |  </w:t>
       </w:r>
-      <w:hyperlink w:history="1" r:id="rId8whv-bdsi_tr_cufgfgrj">
+      <w:hyperlink w:history="1" r:id="rId4m5pq5p7tj89qezxtakq7">
         <w:r>
           <w:rPr>
             <w:rFonts w:ascii="Arial" w:cs="Arial" w:eastAsia="Arial" w:hAnsi="Arial"/>
@@ -303,7 +303,7 @@
         </w:rPr>
         <w:t xml:space="preserve">  </w:t>
       </w:r>
-      <w:hyperlink w:history="1" r:id="rIdcgxr2yoophca_mq4iilid">
+      <w:hyperlink w:history="1" r:id="rIdjqnddeywhonjehhqvf9i7">
         <w:r>
           <w:rPr>
             <w:rFonts w:ascii="Arial" w:cs="Arial" w:eastAsia="Arial" w:hAnsi="Arial"/>
@@ -462,6 +462,33 @@
     </w:p>
     <w:p>
       <w:pPr>
+        <w:spacing w:after="10" w:before="60"/>
+      </w:pPr>
+      <w:r>
+        <w:rPr>
+          <w:rFonts w:ascii="Arial" w:cs="Arial" w:eastAsia="Arial" w:hAnsi="Arial"/>
+          <w:i/>
+          <w:iCs/>
+          <w:sz w:val="20"/>
+          <w:szCs w:val="20"/>
+        </w:rPr>
+        <w:t xml:space="preserve">See more projects and live demos at </w:t>
+      </w:r>
+      <w:hyperlink w:history="1" r:id="rId9owsvxy2pbt988vjddnur">
+        <w:r>
+          <w:rPr>
+            <w:rFonts w:ascii="Arial" w:cs="Arial" w:eastAsia="Arial" w:hAnsi="Arial"/>
+            <w:color w:val="0563C1"/>
+            <w:sz w:val="20"/>
+            <w:szCs w:val="20"/>
+            <w:u w:val="single"/>
+          </w:rPr>
+          <w:t xml:space="preserve">dannlopez.vercel.app</w:t>
+        </w:r>
+      </w:hyperlink>
+    </w:p>
+    <w:p>
+      <w:pPr>
         <w:pBdr>
           <w:bottom w:val="single" w:color="000000" w:sz="6" w:space="3"/>
         </w:pBdr>
@@ -480,7 +507,7 @@
     </w:p>
     <w:p>
       <w:pPr>
-        <w:spacing w:after="10" w:before="50"/>
+        <w:spacing w:after="30" w:before="50"/>
       </w:pPr>
       <w:r>
         <w:rPr>
@@ -500,6 +527,234 @@
         </w:rPr>
         <w:t xml:space="preserve">— Nueva Vizcaya State University (NVSU), Bayombong, Nueva Vizcaya</w:t>
       </w:r>
+    </w:p>
+    <w:p>
+      <w:pPr>
+        <w:pBdr>
+          <w:bottom w:val="single" w:color="000000" w:sz="6" w:space="3"/>
+        </w:pBdr>
+        <w:spacing w:after="40" w:before="140"/>
+      </w:pPr>
+      <w:r>
+        <w:rPr>
+          <w:rFonts w:ascii="Arial" w:cs="Arial" w:eastAsia="Arial" w:hAnsi="Arial"/>
+          <w:b/>
+          <w:bCs/>
+          <w:sz w:val="22"/>
+          <w:szCs w:val="22"/>
+        </w:rPr>
+        <w:t xml:space="preserve">LICENSES &amp; CERTIFICATIONS</w:t>
+      </w:r>
+    </w:p>
+    <w:p>
+      <w:pPr>
+        <w:spacing w:after="18" w:before="30"/>
+      </w:pPr>
+      <w:r>
+        <w:rPr>
+          <w:rFonts w:ascii="Arial" w:cs="Arial" w:eastAsia="Arial" w:hAnsi="Arial"/>
+          <w:b/>
+          <w:bCs/>
+          <w:sz w:val="20"/>
+          <w:szCs w:val="20"/>
+        </w:rPr>
+        <w:t xml:space="preserve">Python Essentials 1  </w:t>
+      </w:r>
+      <w:r>
+        <w:rPr>
+          <w:rFonts w:ascii="Arial" w:cs="Arial" w:eastAsia="Arial" w:hAnsi="Arial"/>
+          <w:sz w:val="20"/>
+          <w:szCs w:val="20"/>
+        </w:rPr>
+        <w:t xml:space="preserve">Cisco · May 2026  </w:t>
+      </w:r>
+      <w:hyperlink w:history="1" r:id="rIdhtuyw8qyzobvnofx0xke-">
+        <w:r>
+          <w:rPr>
+            <w:rFonts w:ascii="Arial" w:cs="Arial" w:eastAsia="Arial" w:hAnsi="Arial"/>
+            <w:color w:val="0563C1"/>
+            <w:sz w:val="19"/>
+            <w:szCs w:val="19"/>
+            <w:u w:val="single"/>
+          </w:rPr>
+          <w:t xml:space="preserve">[Credential]</w:t>
+        </w:r>
+      </w:hyperlink>
+    </w:p>
+    <w:p>
+      <w:pPr>
+        <w:spacing w:after="18" w:before="30"/>
+      </w:pPr>
+      <w:r>
+        <w:rPr>
+          <w:rFonts w:ascii="Arial" w:cs="Arial" w:eastAsia="Arial" w:hAnsi="Arial"/>
+          <w:b/>
+          <w:bCs/>
+          <w:sz w:val="20"/>
+          <w:szCs w:val="20"/>
+        </w:rPr>
+        <w:t xml:space="preserve">Crash Course on Python  </w:t>
+      </w:r>
+      <w:r>
+        <w:rPr>
+          <w:rFonts w:ascii="Arial" w:cs="Arial" w:eastAsia="Arial" w:hAnsi="Arial"/>
+          <w:sz w:val="20"/>
+          <w:szCs w:val="20"/>
+        </w:rPr>
+        <w:t xml:space="preserve">Google · Dec 2024  </w:t>
+      </w:r>
+      <w:hyperlink w:history="1" r:id="rIdhnixdyxe51ep2fynzx0oc">
+        <w:r>
+          <w:rPr>
+            <w:rFonts w:ascii="Arial" w:cs="Arial" w:eastAsia="Arial" w:hAnsi="Arial"/>
+            <w:color w:val="0563C1"/>
+            <w:sz w:val="19"/>
+            <w:szCs w:val="19"/>
+            <w:u w:val="single"/>
+          </w:rPr>
+          <w:t xml:space="preserve">[Credential]</w:t>
+        </w:r>
+      </w:hyperlink>
+    </w:p>
+    <w:p>
+      <w:pPr>
+        <w:spacing w:after="18" w:before="30"/>
+      </w:pPr>
+      <w:r>
+        <w:rPr>
+          <w:rFonts w:ascii="Arial" w:cs="Arial" w:eastAsia="Arial" w:hAnsi="Arial"/>
+          <w:b/>
+          <w:bCs/>
+          <w:sz w:val="20"/>
+          <w:szCs w:val="20"/>
+        </w:rPr>
+        <w:t xml:space="preserve">Introduction to Git and GitHub  </w:t>
+      </w:r>
+      <w:r>
+        <w:rPr>
+          <w:rFonts w:ascii="Arial" w:cs="Arial" w:eastAsia="Arial" w:hAnsi="Arial"/>
+          <w:sz w:val="20"/>
+          <w:szCs w:val="20"/>
+        </w:rPr>
+        <w:t xml:space="preserve">Google · Dec 2024  </w:t>
+      </w:r>
+      <w:hyperlink w:history="1" r:id="rId9_e_zixv_k1u5w6vczflr">
+        <w:r>
+          <w:rPr>
+            <w:rFonts w:ascii="Arial" w:cs="Arial" w:eastAsia="Arial" w:hAnsi="Arial"/>
+            <w:color w:val="0563C1"/>
+            <w:sz w:val="19"/>
+            <w:szCs w:val="19"/>
+            <w:u w:val="single"/>
+          </w:rPr>
+          <w:t xml:space="preserve">[Credential]</w:t>
+        </w:r>
+      </w:hyperlink>
+    </w:p>
+    <w:p>
+      <w:pPr>
+        <w:spacing w:after="18" w:before="30"/>
+      </w:pPr>
+      <w:r>
+        <w:rPr>
+          <w:rFonts w:ascii="Arial" w:cs="Arial" w:eastAsia="Arial" w:hAnsi="Arial"/>
+          <w:b/>
+          <w:bCs/>
+          <w:sz w:val="20"/>
+          <w:szCs w:val="20"/>
+        </w:rPr>
+        <w:t xml:space="preserve">Learn C++ Programming — Beginner to Advance  </w:t>
+      </w:r>
+      <w:r>
+        <w:rPr>
+          <w:rFonts w:ascii="Arial" w:cs="Arial" w:eastAsia="Arial" w:hAnsi="Arial"/>
+          <w:sz w:val="20"/>
+          <w:szCs w:val="20"/>
+        </w:rPr>
+        <w:t xml:space="preserve">Udemy · Aug 2024  </w:t>
+      </w:r>
+      <w:hyperlink w:history="1" r:id="rIdmuqptx_1vukpjloarjva-">
+        <w:r>
+          <w:rPr>
+            <w:rFonts w:ascii="Arial" w:cs="Arial" w:eastAsia="Arial" w:hAnsi="Arial"/>
+            <w:color w:val="0563C1"/>
+            <w:sz w:val="19"/>
+            <w:szCs w:val="19"/>
+            <w:u w:val="single"/>
+          </w:rPr>
+          <w:t xml:space="preserve">[Credential]</w:t>
+        </w:r>
+      </w:hyperlink>
+    </w:p>
+    <w:p>
+      <w:pPr>
+        <w:spacing w:after="18" w:before="30"/>
+      </w:pPr>
+      <w:r>
+        <w:rPr>
+          <w:rFonts w:ascii="Arial" w:cs="Arial" w:eastAsia="Arial" w:hAnsi="Arial"/>
+          <w:b/>
+          <w:bCs/>
+          <w:sz w:val="20"/>
+          <w:szCs w:val="20"/>
+        </w:rPr>
+        <w:t xml:space="preserve">Start the UX Design Process: Empathize, Define, and Ideate  </w:t>
+      </w:r>
+      <w:r>
+        <w:rPr>
+          <w:rFonts w:ascii="Arial" w:cs="Arial" w:eastAsia="Arial" w:hAnsi="Arial"/>
+          <w:sz w:val="20"/>
+          <w:szCs w:val="20"/>
+        </w:rPr>
+        <w:t xml:space="preserve">Google · May 2024  </w:t>
+      </w:r>
+      <w:hyperlink w:history="1" r:id="rIdbf-_f2w3xnkema7z4vjif">
+        <w:r>
+          <w:rPr>
+            <w:rFonts w:ascii="Arial" w:cs="Arial" w:eastAsia="Arial" w:hAnsi="Arial"/>
+            <w:color w:val="0563C1"/>
+            <w:sz w:val="19"/>
+            <w:szCs w:val="19"/>
+            <w:u w:val="single"/>
+          </w:rPr>
+          <w:t xml:space="preserve">[Credential]</w:t>
+        </w:r>
+      </w:hyperlink>
+    </w:p>
+    <w:p>
+      <w:pPr>
+        <w:spacing w:after="18" w:before="30"/>
+      </w:pPr>
+      <w:r>
+        <w:rPr>
+          <w:rFonts w:ascii="Arial" w:cs="Arial" w:eastAsia="Arial" w:hAnsi="Arial"/>
+          <w:b/>
+          <w:bCs/>
+          <w:sz w:val="20"/>
+          <w:szCs w:val="20"/>
+        </w:rPr>
+        <w:t xml:space="preserve">Foundations of User Experience (UX) Design  </w:t>
+      </w:r>
+      <w:r>
+        <w:rPr>
+          <w:rFonts w:ascii="Arial" w:cs="Arial" w:eastAsia="Arial" w:hAnsi="Arial"/>
+          <w:sz w:val="20"/>
+          <w:szCs w:val="20"/>
+        </w:rPr>
+        <w:t xml:space="preserve">Google · May 2024  </w:t>
+      </w:r>
+      <w:hyperlink w:history="1" r:id="rIdcctdonnjbe3eo2id5o-hq">
+        <w:r>
+          <w:rPr>
+            <w:rFonts w:ascii="Arial" w:cs="Arial" w:eastAsia="Arial" w:hAnsi="Arial"/>
+            <w:color w:val="0563C1"/>
+            <w:sz w:val="19"/>
+            <w:szCs w:val="19"/>
+            <w:u w:val="single"/>
+          </w:rPr>
+          <w:t xml:space="preserve">[Credential]</w:t>
+        </w:r>
+      </w:hyperlink>
     </w:p>
     <w:p>
       <w:pPr>

</xml_diff>

<commit_message>
docs: update resume file with latest professional experience
</commit_message>
<xml_diff>
--- a/public/resume.docx
+++ b/public/resume.docx
@@ -6,6 +6,13 @@
       <w:pPr>
         <w:spacing w:before="0" w:after="20"/>
         <w:jc w:val="both"/>
+        <w:rPr>
+          <w:rFonts w:ascii="Arial" w:hAnsi="Arial" w:eastAsia="Arial" w:cs="Arial"/>
+          <w:b/>
+          <w:bCs/>
+          <w:sz w:val="36"/>
+          <w:szCs w:val="36"/>
+        </w:rPr>
       </w:pPr>
       <w:r>
         <w:rPr>
@@ -16,13 +23,13 @@
           <wp:anchor distT="0" distB="0" distL="114300" distR="114300" simplePos="0" relativeHeight="251659264" behindDoc="0" locked="0" layoutInCell="1" allowOverlap="1">
             <wp:simplePos x="0" y="0"/>
             <wp:positionH relativeFrom="column">
-              <wp:posOffset>4815840</wp:posOffset>
+              <wp:posOffset>5008245</wp:posOffset>
             </wp:positionH>
             <wp:positionV relativeFrom="paragraph">
-              <wp:posOffset>-296545</wp:posOffset>
+              <wp:posOffset>12700</wp:posOffset>
             </wp:positionV>
             <wp:extent cx="1828800" cy="1828800"/>
-            <wp:effectExtent l="12700" t="12700" r="12700" b="12700"/>
+            <wp:effectExtent l="0" t="0" r="0" b="0"/>
             <wp:wrapNone/>
             <wp:docPr id="1" name="Picture 1" descr="avatar-2"/>
             <wp:cNvGraphicFramePr>
@@ -63,7 +70,11 @@
           </wp:anchor>
         </w:drawing>
       </w:r>
-      <w:r>
+    </w:p>
+    <w:p>
+      <w:pPr>
+        <w:spacing w:before="0" w:after="20"/>
+        <w:jc w:val="both"/>
         <w:rPr>
           <w:rFonts w:ascii="Arial" w:hAnsi="Arial" w:eastAsia="Arial" w:cs="Arial"/>
           <w:b/>
@@ -71,6 +82,15 @@
           <w:sz w:val="36"/>
           <w:szCs w:val="36"/>
         </w:rPr>
+      </w:pPr>
+      <w:r>
+        <w:rPr>
+          <w:rFonts w:ascii="Arial" w:hAnsi="Arial" w:eastAsia="Arial" w:cs="Arial"/>
+          <w:b/>
+          <w:bCs/>
+          <w:sz w:val="36"/>
+          <w:szCs w:val="36"/>
+        </w:rPr>
         <w:t>LESTER DANN G. LOPEZ</w:t>
       </w:r>
     </w:p>
@@ -129,58 +149,86 @@
         <w:spacing w:before="0" w:after="20"/>
         <w:jc w:val="both"/>
         <w:rPr>
-          <w:rFonts w:ascii="Arial" w:hAnsi="Arial" w:eastAsia="Arial" w:cs="Arial"/>
-          <w:sz w:val="20"/>
-          <w:szCs w:val="20"/>
-        </w:rPr>
-      </w:pPr>
-      <w:r>
-        <w:fldChar w:fldCharType="begin"/>
-      </w:r>
-      <w:r>
-        <w:instrText xml:space="preserve"> HYPERLINK "https://dannlopez.vercel.app/" </w:instrText>
-      </w:r>
-      <w:r>
-        <w:fldChar w:fldCharType="separate"/>
-      </w:r>
-      <w:r>
-        <w:rPr>
-          <w:rFonts w:ascii="Arial" w:hAnsi="Arial" w:eastAsia="Arial" w:cs="Arial"/>
-          <w:color w:val="0563C1"/>
-          <w:sz w:val="20"/>
-          <w:szCs w:val="20"/>
-          <w:u w:val="single"/>
-        </w:rPr>
-        <w:t>dannlopez.vercel.app</w:t>
-      </w:r>
-      <w:r>
-        <w:rPr>
-          <w:rFonts w:ascii="Arial" w:hAnsi="Arial" w:eastAsia="Arial" w:cs="Arial"/>
-          <w:color w:val="0563C1"/>
-          <w:sz w:val="20"/>
-          <w:szCs w:val="20"/>
-          <w:u w:val="single"/>
-        </w:rPr>
-        <w:fldChar w:fldCharType="end"/>
-      </w:r>
-      <w:r>
-        <w:rPr>
-          <w:rFonts w:ascii="Arial" w:hAnsi="Arial" w:eastAsia="Arial" w:cs="Arial"/>
-          <w:sz w:val="20"/>
-          <w:szCs w:val="20"/>
-        </w:rPr>
-        <w:t xml:space="preserve">  </w:t>
+          <w:rFonts w:hint="default" w:ascii="Arial" w:hAnsi="Arial" w:eastAsia="Arial" w:cs="Arial"/>
+          <w:sz w:val="20"/>
+          <w:szCs w:val="20"/>
+          <w:lang w:val="en-US"/>
+        </w:rPr>
+      </w:pPr>
+      <w:r>
+        <w:rPr>
+          <w:rFonts w:hint="default" w:ascii="Arial" w:hAnsi="Arial" w:eastAsia="Arial" w:cs="Arial"/>
+          <w:sz w:val="20"/>
+          <w:szCs w:val="20"/>
+          <w:lang w:val="en-US"/>
+        </w:rPr>
+        <w:t>09943114963</w:t>
       </w:r>
     </w:p>
     <w:p>
       <w:pPr>
         <w:spacing w:before="0" w:after="20"/>
         <w:jc w:val="both"/>
+        <w:rPr>
+          <w:rFonts w:ascii="Arial" w:hAnsi="Arial" w:eastAsia="Arial" w:cs="Arial"/>
+          <w:sz w:val="20"/>
+          <w:szCs w:val="20"/>
+        </w:rPr>
       </w:pPr>
       <w:r>
         <w:fldChar w:fldCharType="begin"/>
       </w:r>
       <w:r>
+        <w:instrText xml:space="preserve"> HYPERLINK "https://dannlopez.vercel.app/" </w:instrText>
+      </w:r>
+      <w:r>
+        <w:fldChar w:fldCharType="separate"/>
+      </w:r>
+      <w:r>
+        <w:rPr>
+          <w:rFonts w:ascii="Arial" w:hAnsi="Arial" w:eastAsia="Arial" w:cs="Arial"/>
+          <w:color w:val="0563C1"/>
+          <w:sz w:val="20"/>
+          <w:szCs w:val="20"/>
+          <w:u w:val="single"/>
+        </w:rPr>
+        <w:t>dannlopez.vercel.app</w:t>
+      </w:r>
+      <w:r>
+        <w:rPr>
+          <w:rFonts w:ascii="Arial" w:hAnsi="Arial" w:eastAsia="Arial" w:cs="Arial"/>
+          <w:color w:val="0563C1"/>
+          <w:sz w:val="20"/>
+          <w:szCs w:val="20"/>
+          <w:u w:val="single"/>
+        </w:rPr>
+        <w:fldChar w:fldCharType="end"/>
+      </w:r>
+      <w:r>
+        <w:rPr>
+          <w:rFonts w:ascii="Arial" w:hAnsi="Arial" w:eastAsia="Arial" w:cs="Arial"/>
+          <w:sz w:val="20"/>
+          <w:szCs w:val="20"/>
+        </w:rPr>
+        <w:t xml:space="preserve">  </w:t>
+      </w:r>
+    </w:p>
+    <w:p>
+      <w:pPr>
+        <w:spacing w:before="0" w:after="20"/>
+        <w:jc w:val="both"/>
+        <w:rPr>
+          <w:rFonts w:ascii="Arial" w:hAnsi="Arial" w:eastAsia="Arial" w:cs="Arial"/>
+          <w:color w:val="0563C1"/>
+          <w:sz w:val="20"/>
+          <w:szCs w:val="20"/>
+          <w:u w:val="single"/>
+        </w:rPr>
+      </w:pPr>
+      <w:r>
+        <w:fldChar w:fldCharType="begin"/>
+      </w:r>
+      <w:r>
         <w:instrText xml:space="preserve"> HYPERLINK "https://www.linkedin.com/in/lester-dann-lopez-26874b190/" </w:instrText>
       </w:r>
       <w:r>
@@ -209,31 +257,27 @@
     </w:p>
     <w:p>
       <w:pPr>
-        <w:pBdr>
-          <w:bottom w:val="single" w:color="000000" w:sz="6" w:space="3"/>
-        </w:pBdr>
-        <w:spacing w:before="140" w:after="40"/>
-        <w:rPr>
-          <w:rFonts w:ascii="Arial" w:hAnsi="Arial" w:eastAsia="Arial" w:cs="Arial"/>
-          <w:b/>
-          <w:bCs/>
-          <w:sz w:val="22"/>
-          <w:szCs w:val="22"/>
-        </w:rPr>
-      </w:pPr>
-    </w:p>
-    <w:p>
-      <w:pPr>
-        <w:pBdr>
-          <w:bottom w:val="single" w:color="000000" w:sz="6" w:space="3"/>
-        </w:pBdr>
-        <w:spacing w:before="140" w:after="40"/>
-        <w:rPr>
-          <w:rFonts w:ascii="Arial" w:hAnsi="Arial" w:eastAsia="Arial" w:cs="Arial"/>
-          <w:b/>
-          <w:bCs/>
-          <w:sz w:val="22"/>
-          <w:szCs w:val="22"/>
+        <w:spacing w:before="0" w:after="20"/>
+        <w:jc w:val="both"/>
+        <w:rPr>
+          <w:rFonts w:ascii="Arial" w:hAnsi="Arial" w:eastAsia="Arial" w:cs="Arial"/>
+          <w:color w:val="0563C1"/>
+          <w:sz w:val="20"/>
+          <w:szCs w:val="20"/>
+          <w:u w:val="single"/>
+        </w:rPr>
+      </w:pPr>
+    </w:p>
+    <w:p>
+      <w:pPr>
+        <w:spacing w:before="0" w:after="20"/>
+        <w:jc w:val="both"/>
+        <w:rPr>
+          <w:rFonts w:ascii="Arial" w:hAnsi="Arial" w:eastAsia="Arial" w:cs="Arial"/>
+          <w:color w:val="0563C1"/>
+          <w:sz w:val="20"/>
+          <w:szCs w:val="20"/>
+          <w:u w:val="single"/>
         </w:rPr>
       </w:pPr>
     </w:p>
@@ -391,7 +435,24 @@
           <w:sz w:val="20"/>
           <w:szCs w:val="20"/>
         </w:rPr>
-        <w:t>Next.js 15, React, TypeScript, Tailwind CSS, Shadcn/UI, Supabase, PostgreSQL, REST APIs, React Native</w:t>
+        <w:t>Next.js 15, React, TypeScript, Tailwind CSS, Shadcn/UI, Supabase</w:t>
+      </w:r>
+      <w:r>
+        <w:rPr>
+          <w:rFonts w:hint="default" w:ascii="Arial" w:hAnsi="Arial" w:eastAsia="Arial" w:cs="Arial"/>
+          <w:sz w:val="20"/>
+          <w:szCs w:val="20"/>
+          <w:lang w:val="en-US"/>
+        </w:rPr>
+        <w:t xml:space="preserve"> (Auth &amp; Database)</w:t>
+      </w:r>
+      <w:r>
+        <w:rPr>
+          <w:rFonts w:ascii="Arial" w:hAnsi="Arial" w:eastAsia="Arial" w:cs="Arial"/>
+          <w:sz w:val="20"/>
+          <w:szCs w:val="20"/>
+        </w:rPr>
+        <w:t>, PostgreSQL, REST APIs, React Native</w:t>
       </w:r>
     </w:p>
     <w:p>
@@ -609,8 +670,6 @@
         </w:rPr>
         <w:t>Freelance business website for an Australian automotive detailing company, delivered remotely.</w:t>
       </w:r>
-      <w:bookmarkStart w:id="0" w:name="_GoBack"/>
-      <w:bookmarkEnd w:id="0"/>
     </w:p>
     <w:p>
       <w:pPr>
@@ -1234,23 +1293,26 @@
     <w:p>
       <w:pPr>
         <w:spacing w:before="60" w:after="10"/>
-        <w:rPr>
-          <w:rFonts w:hint="default" w:ascii="Arial" w:hAnsi="Arial" w:eastAsia="Arial" w:cs="Arial"/>
+      </w:pPr>
+      <w:r>
+        <w:rPr>
+          <w:rFonts w:ascii="Arial" w:hAnsi="Arial" w:eastAsia="Arial" w:cs="Arial"/>
           <w:i/>
           <w:iCs/>
           <w:sz w:val="20"/>
           <w:szCs w:val="20"/>
         </w:rPr>
-      </w:pPr>
-      <w:r>
-        <w:rPr>
-          <w:rFonts w:ascii="Arial" w:hAnsi="Arial" w:eastAsia="Arial" w:cs="Arial"/>
+        <w:t xml:space="preserve">View all verified credentials at </w:t>
+      </w:r>
+      <w:r>
+        <w:rPr>
+          <w:rFonts w:hint="default" w:ascii="Arial" w:hAnsi="Arial" w:eastAsia="Arial" w:cs="Arial"/>
           <w:i/>
           <w:iCs/>
           <w:sz w:val="20"/>
           <w:szCs w:val="20"/>
         </w:rPr>
-        <w:t xml:space="preserve">View all verified credentials at </w:t>
+        <w:fldChar w:fldCharType="begin"/>
       </w:r>
       <w:r>
         <w:rPr>
@@ -1260,7 +1322,7 @@
           <w:sz w:val="20"/>
           <w:szCs w:val="20"/>
         </w:rPr>
-        <w:fldChar w:fldCharType="begin"/>
+        <w:instrText xml:space="preserve"> HYPERLINK "https://dannlopez.vercel.app/#credentials" </w:instrText>
       </w:r>
       <w:r>
         <w:rPr>
@@ -1270,47 +1332,34 @@
           <w:sz w:val="20"/>
           <w:szCs w:val="20"/>
         </w:rPr>
-        <w:instrText xml:space="preserve"> HYPERLINK "https://dannlopez.vercel.app/#credentials" </w:instrText>
-      </w:r>
-      <w:r>
-        <w:rPr>
+        <w:fldChar w:fldCharType="separate"/>
+      </w:r>
+      <w:r>
+        <w:rPr>
+          <w:rStyle w:val="12"/>
           <w:rFonts w:hint="default" w:ascii="Arial" w:hAnsi="Arial" w:eastAsia="Arial" w:cs="Arial"/>
           <w:i/>
           <w:iCs/>
           <w:sz w:val="20"/>
           <w:szCs w:val="20"/>
         </w:rPr>
-        <w:fldChar w:fldCharType="separate"/>
-      </w:r>
-      <w:r>
-        <w:rPr>
-          <w:rStyle w:val="12"/>
+        <w:t>https://dannlopez.vercel.app/#credentials</w:t>
+      </w:r>
+      <w:r>
+        <w:rPr>
           <w:rFonts w:hint="default" w:ascii="Arial" w:hAnsi="Arial" w:eastAsia="Arial" w:cs="Arial"/>
           <w:i/>
           <w:iCs/>
           <w:sz w:val="20"/>
           <w:szCs w:val="20"/>
         </w:rPr>
-        <w:t>https://dannlopez.vercel.app/#credentials</w:t>
-      </w:r>
-      <w:r>
-        <w:rPr>
-          <w:rFonts w:hint="default" w:ascii="Arial" w:hAnsi="Arial" w:eastAsia="Arial" w:cs="Arial"/>
-          <w:i/>
-          <w:iCs/>
-          <w:sz w:val="20"/>
-          <w:szCs w:val="20"/>
-        </w:rPr>
         <w:fldChar w:fldCharType="end"/>
       </w:r>
-    </w:p>
-    <w:p>
-      <w:pPr>
-        <w:spacing w:before="40" w:after="30"/>
-      </w:pPr>
+      <w:bookmarkStart w:id="0" w:name="_GoBack"/>
+      <w:bookmarkEnd w:id="0"/>
     </w:p>
     <w:sectPr>
-      <w:pgSz w:w="11906" w:h="16838"/>
+      <w:pgSz w:w="12240" w:h="15840"/>
       <w:pgMar w:top="720" w:right="720" w:bottom="720" w:left="720" w:header="708" w:footer="708" w:gutter="0"/>
       <w:cols w:space="720" w:num="1"/>
       <w:docGrid w:linePitch="360" w:charSpace="0"/>

</xml_diff>

<commit_message>
chore: update resume.docx and remove temporary backup file
</commit_message>
<xml_diff>
--- a/public/resume.docx
+++ b/public/resume.docx
@@ -23,7 +23,7 @@
           <wp:anchor distT="0" distB="0" distL="114300" distR="114300" simplePos="0" relativeHeight="251659264" behindDoc="0" locked="0" layoutInCell="1" allowOverlap="1">
             <wp:simplePos x="0" y="0"/>
             <wp:positionH relativeFrom="column">
-              <wp:posOffset>5008245</wp:posOffset>
+              <wp:posOffset>4813935</wp:posOffset>
             </wp:positionH>
             <wp:positionV relativeFrom="paragraph">
               <wp:posOffset>12700</wp:posOffset>
@@ -141,7 +141,7 @@
           <w:sz w:val="20"/>
           <w:szCs w:val="20"/>
         </w:rPr>
-        <w:t xml:space="preserve">Lesterdannlopez7@gmail.com  </w:t>
+        <w:t>Lesterdannlopez7@gmail.com</w:t>
       </w:r>
     </w:p>
     <w:p>
@@ -797,6 +797,7 @@
         <w:ind w:left="840" w:leftChars="0" w:hanging="420" w:firstLineChars="0"/>
         <w:jc w:val="both"/>
       </w:pPr>
+      <w:bookmarkStart w:id="0" w:name="_GoBack"/>
       <w:r>
         <w:rPr>
           <w:rFonts w:ascii="Arial" w:hAnsi="Arial" w:eastAsia="Arial" w:cs="Arial"/>
@@ -824,7 +825,16 @@
           <w:sz w:val="20"/>
           <w:szCs w:val="20"/>
         </w:rPr>
-        <w:t>Church management web app for scheduling, announcements, and congregation coordination.</w:t>
+        <w:t xml:space="preserve">Church management web app for scheduling, announcements, and </w:t>
+      </w:r>
+      <w:bookmarkEnd w:id="0"/>
+      <w:r>
+        <w:rPr>
+          <w:rFonts w:ascii="Arial" w:hAnsi="Arial" w:eastAsia="Arial" w:cs="Arial"/>
+          <w:sz w:val="20"/>
+          <w:szCs w:val="20"/>
+        </w:rPr>
+        <w:t>congregation coordination.</w:t>
       </w:r>
     </w:p>
     <w:p>
@@ -1355,11 +1365,9 @@
         </w:rPr>
         <w:fldChar w:fldCharType="end"/>
       </w:r>
-      <w:bookmarkStart w:id="0" w:name="_GoBack"/>
-      <w:bookmarkEnd w:id="0"/>
     </w:p>
     <w:sectPr>
-      <w:pgSz w:w="12240" w:h="15840"/>
+      <w:pgSz w:w="11904" w:h="16836"/>
       <w:pgMar w:top="720" w:right="720" w:bottom="720" w:left="720" w:header="708" w:footer="708" w:gutter="0"/>
       <w:cols w:space="720" w:num="1"/>
       <w:docGrid w:linePitch="360" w:charSpace="0"/>

</xml_diff>